<commit_message>
English review: Inference with M-estimators on adaptively collected data (final build)
All 17 entries and the main text in English; KAUZ-OED section 7 reviewed
adversarially (22 fixes); fact checks of entries p07, p11, p12, p14-p16;
LibreOffice-safe OMML conversion (no broken equations).

Co-Authored-By: Claude Opus 5.5 <noreply@anthropic.com>
Claude-Session: https://claude.ai/code/session_016Cdcj2FTAQGBVsJUyYJR2M
</commit_message>
<xml_diff>
--- a/docs/literature/Literature_review_Non-Bayesian_Equation_Learning_2020-2026.docx
+++ b/docs/literature/Literature_review_Non-Bayesian_Equation_Learning_2020-2026.docx
@@ -466,7 +466,7 @@
             <w:vAlign w:val="top"/>
           </w:tcPr>
           <w:p>
-            <w:hyperlink w:history="1" r:id="rIdsqxubf1_0gi0bcylrzpcq">
+            <w:hyperlink w:history="1" r:id="rIdu0qdua2uvtu2jameic6h3">
               <w:r>
                 <w:rPr>
                   <w:color w:val="1D4ED8"/>
@@ -7234,7 +7234,7 @@
             <w:vAlign w:val="top"/>
           </w:tcPr>
           <w:p>
-            <w:hyperlink w:history="1" r:id="rIdrqza9j9nkulmsdopg8naw">
+            <w:hyperlink w:history="1" r:id="rIdoofczmswv85jvmpe8_zfc">
               <w:r>
                 <w:rPr>
                   <w:color w:val="1D4ED8"/>
@@ -8333,7 +8333,7 @@
             <w:vAlign w:val="top"/>
           </w:tcPr>
           <w:p>
-            <w:hyperlink w:history="1" r:id="rIdnozdnp2csupjfbk51c70l">
+            <w:hyperlink w:history="1" r:id="rIdponditfhjspz8ph3wuj5a">
               <w:r>
                 <w:rPr>
                   <w:color w:val="1D4ED8"/>
@@ -9265,7 +9265,7 @@
             <w:vAlign w:val="top"/>
           </w:tcPr>
           <w:p>
-            <w:hyperlink w:history="1" r:id="rIdipn4-lkijsti0io6ihkbe">
+            <w:hyperlink w:history="1" r:id="rIdf3wyri_0hnllnobi9koqi">
               <w:r>
                 <w:rPr>
                   <w:color w:val="1D4ED8"/>
@@ -10321,7 +10321,7 @@
             <w:vAlign w:val="top"/>
           </w:tcPr>
           <w:p>
-            <w:hyperlink w:history="1" r:id="rIdelwesqyaiihqjer0plu3s">
+            <w:hyperlink w:history="1" r:id="rIdmwtg0pyx5rqsmvaglixdc">
               <w:r>
                 <w:rPr>
                   <w:color w:val="1D4ED8"/>
@@ -11241,7 +11241,7 @@
             <w:vAlign w:val="top"/>
           </w:tcPr>
           <w:p>
-            <w:hyperlink w:history="1" r:id="rId2pfsae8xwu6qyws27zr5x">
+            <w:hyperlink w:history="1" r:id="rIdwszo5te6tcmpqxlxoiplm">
               <w:r>
                 <w:rPr>
                   <w:color w:val="1D4ED8"/>
@@ -12038,7 +12038,7 @@
             <w:vAlign w:val="top"/>
           </w:tcPr>
           <w:p>
-            <w:hyperlink w:history="1" r:id="rIdevynfl_nzehgyv45eacj7">
+            <w:hyperlink w:history="1" r:id="rIdej4v8yeview1jaojcmb4s">
               <w:r>
                 <w:rPr>
                   <w:color w:val="1D4ED8"/>
@@ -12913,7 +12913,7 @@
             <w:vAlign w:val="top"/>
           </w:tcPr>
           <w:p>
-            <w:hyperlink w:history="1" r:id="rIdly3nk7z6wnfpvcixzerz2">
+            <w:hyperlink w:history="1" r:id="rId6u6oi8gidfzp_hw4_jc5b">
               <w:r>
                 <w:rPr>
                   <w:color w:val="1D4ED8"/>
@@ -13859,7 +13859,7 @@
             <w:vAlign w:val="top"/>
           </w:tcPr>
           <w:p>
-            <w:hyperlink w:history="1" r:id="rId_5up36lllralxiqxktk_f">
+            <w:hyperlink w:history="1" r:id="rIdf77cp9ubvxauq4ny35ire">
               <w:r>
                 <w:rPr>
                   <w:color w:val="1D4ED8"/>
@@ -14677,7 +14677,7 @@
             <w:vAlign w:val="top"/>
           </w:tcPr>
           <w:p>
-            <w:hyperlink w:history="1" r:id="rIdj1vil0ohp7rwueg13xfdf">
+            <w:hyperlink w:history="1" r:id="rId-frhvqhln4gb_vr1b1_ou">
               <w:r>
                 <w:rPr>
                   <w:color w:val="1D4ED8"/>
@@ -15519,7 +15519,7 @@
             <w:vAlign w:val="top"/>
           </w:tcPr>
           <w:p>
-            <w:hyperlink w:history="1" r:id="rId2whtciiqftztolelgzkgg">
+            <w:hyperlink w:history="1" r:id="rIdrzj_zvi8ykcn21c4p1dnv">
               <w:r>
                 <w:rPr>
                   <w:color w:val="1D4ED8"/>
@@ -16331,7 +16331,7 @@
             <w:vAlign w:val="top"/>
           </w:tcPr>
           <w:p>
-            <w:hyperlink w:history="1" r:id="rIdt9rkwncyrlatdqwuft-ol">
+            <w:hyperlink w:history="1" r:id="rIdrkgaonzo76su2n1kxp8hs">
               <w:r>
                 <w:rPr>
                   <w:color w:val="1D4ED8"/>
@@ -17164,7 +17164,7 @@
             <w:vAlign w:val="top"/>
           </w:tcPr>
           <w:p>
-            <w:hyperlink w:history="1" r:id="rIdehsmyya-bzhvlofjvzk4p">
+            <w:hyperlink w:history="1" r:id="rIdvucg6txaeshebsifgbi-v">
               <w:r>
                 <w:rPr>
                   <w:color w:val="1D4ED8"/>
@@ -18059,7 +18059,7 @@
             <w:vAlign w:val="top"/>
           </w:tcPr>
           <w:p>
-            <w:hyperlink w:history="1" r:id="rId_edihvypcuwnz5jk1nh4k">
+            <w:hyperlink w:history="1" r:id="rIdu8wf-5f9r8g9k4dfye_tf">
               <w:r>
                 <w:rPr>
                   <w:color w:val="1D4ED8"/>
@@ -18988,7 +18988,7 @@
             <w:vAlign w:val="top"/>
           </w:tcPr>
           <w:p>
-            <w:hyperlink w:history="1" r:id="rId2a4fnqwnfpypctyxsfl2g">
+            <w:hyperlink w:history="1" r:id="rId6bx68cd0l42fvf3gdbyiv">
               <w:r>
                 <w:rPr>
                   <w:color w:val="1D4ED8"/>
@@ -19775,7 +19775,7 @@
             <w:vAlign w:val="top"/>
           </w:tcPr>
           <w:p>
-            <w:hyperlink w:history="1" r:id="rIdnhucbs90iib5bgao7kxm7">
+            <w:hyperlink w:history="1" r:id="rIdaq8wvlp8jd3u3no3xcw7b">
               <w:r>
                 <w:rPr>
                   <w:color w:val="1D4ED8"/>
@@ -20676,7 +20676,7 @@
             <w:vAlign w:val="top"/>
           </w:tcPr>
           <w:p>
-            <w:hyperlink w:history="1" r:id="rIdb19_vrlvgqkrj2gvbplkq">
+            <w:hyperlink w:history="1" r:id="rIdxk94n9ffyief8ah2oje-v">
               <w:r>
                 <w:rPr>
                   <w:color w:val="1D4ED8"/>
@@ -21685,7 +21685,7 @@
             <w:vAlign w:val="top"/>
           </w:tcPr>
           <w:p>
-            <w:hyperlink w:history="1" r:id="rIdlv1gcvpphzcxkzpz4t_wz">
+            <w:hyperlink w:history="1" r:id="rIdoy2talaoxliek8dqu46ni">
               <w:r>
                 <w:rPr>
                   <w:color w:val="1D4ED8"/>
@@ -22861,7 +22861,7 @@
             <w:vAlign w:val="top"/>
           </w:tcPr>
           <w:p>
-            <w:hyperlink w:history="1" r:id="rIdpvuunhgjrydjstimykmhu">
+            <w:hyperlink w:history="1" r:id="rIdniaqfsbsgnuwm79ahxvrs">
               <w:r>
                 <w:rPr>
                   <w:color w:val="1D4ED8"/>
@@ -23848,7 +23848,7 @@
             <w:vAlign w:val="top"/>
           </w:tcPr>
           <w:p>
-            <w:hyperlink w:history="1" r:id="rIdvep631rqiw6zeg7dbx7iv">
+            <w:hyperlink w:history="1" r:id="rIdisfh_hhgbrakhbrxaso5z">
               <w:r>
                 <w:rPr>
                   <w:color w:val="1D4ED8"/>
@@ -24627,7 +24627,7 @@
             <w:vAlign w:val="top"/>
           </w:tcPr>
           <w:p>
-            <w:hyperlink w:history="1" r:id="rIdbfdmbufo4ddoiroa7g2bu">
+            <w:hyperlink w:history="1" r:id="rIdscvxv-2okht3gedqplmqo">
               <w:r>
                 <w:rPr>
                   <w:color w:val="1D4ED8"/>
@@ -28232,7 +28232,7 @@
               </w:rPr>
               <w:t xml:space="preserve">, 17, 20200055. </w:t>
             </w:r>
-            <w:hyperlink w:history="1" r:id="rIdxfo-ymuiln-aywrjhpho6">
+            <w:hyperlink w:history="1" r:id="rIdx25ld3oobz8x25tnyhmwq">
               <w:r>
                 <w:rPr>
                   <w:color w:val="1D4ED8"/>
@@ -28398,7 +28398,7 @@
               </w:rPr>
               <w:t xml:space="preserve">, 72(4), 417–473. </w:t>
             </w:r>
-            <w:hyperlink w:history="1" r:id="rIdizeloka50uihshmi42er6">
+            <w:hyperlink w:history="1" r:id="rIdk7cpmcagm75haf4zicuto">
               <w:r>
                 <w:rPr>
                   <w:color w:val="1D4ED8"/>
@@ -30975,7 +30975,7 @@
         </m:r>
       </m:oMath>
       <w:r>
-        <w:t xml:space="preserve"> and, when two structures remain competitive, with the T-optimal criterion.</w:t>
+        <w:t xml:space="preserve"> and, when two structures are still competing, with the T-optimal criterion.</w:t>
       </w:r>
     </w:p>
     <w:p>
@@ -31812,7 +31812,7 @@
         </w:rPr>
         <w:t xml:space="preserve"> </w:t>
       </w:r>
-      <w:hyperlink w:history="1" r:id="rIdforcve2tp3ynccc8at0iq">
+      <w:hyperlink w:history="1" r:id="rIdwiuuzhj_uamfwqam61b5l">
         <w:r>
           <w:rPr>
             <w:color w:val="1D4ED8"/>
@@ -31873,7 +31873,7 @@
         </w:rPr>
         <w:t xml:space="preserve"> </w:t>
       </w:r>
-      <w:hyperlink w:history="1" r:id="rIdr25dezuwdl4eg0m5cqgsi">
+      <w:hyperlink w:history="1" r:id="rIdev-ofwa-atp1fplbrlvw0">
         <w:r>
           <w:rPr>
             <w:color w:val="1D4ED8"/>
@@ -31934,7 +31934,7 @@
         </w:rPr>
         <w:t xml:space="preserve"> </w:t>
       </w:r>
-      <w:hyperlink w:history="1" r:id="rIdnh7htphv5nfj5ljojugkl">
+      <w:hyperlink w:history="1" r:id="rIdgwro7mhj7bot3ff-pamoo">
         <w:r>
           <w:rPr>
             <w:color w:val="1D4ED8"/>
@@ -31995,7 +31995,7 @@
         </w:rPr>
         <w:t xml:space="preserve"> </w:t>
       </w:r>
-      <w:hyperlink w:history="1" r:id="rIdzpjpbhygbswtdaquqnalw">
+      <w:hyperlink w:history="1" r:id="rIddcs4canuptybfj4fzkxxt">
         <w:r>
           <w:rPr>
             <w:color w:val="1D4ED8"/>
@@ -32056,7 +32056,7 @@
         </w:rPr>
         <w:t xml:space="preserve"> </w:t>
       </w:r>
-      <w:hyperlink w:history="1" r:id="rIdub1qkfja1ok4dzs_gxsfl">
+      <w:hyperlink w:history="1" r:id="rIdgchbwgezgrgalfme9ewrw">
         <w:r>
           <w:rPr>
             <w:color w:val="1D4ED8"/>
@@ -32117,7 +32117,7 @@
         </w:rPr>
         <w:t xml:space="preserve"> </w:t>
       </w:r>
-      <w:hyperlink w:history="1" r:id="rId8pzmjumr_4sa4oeuvh4kd">
+      <w:hyperlink w:history="1" r:id="rId_iyklwzv0wblvhktwconl">
         <w:r>
           <w:rPr>
             <w:color w:val="1D4ED8"/>
@@ -32178,7 +32178,7 @@
         </w:rPr>
         <w:t xml:space="preserve"> </w:t>
       </w:r>
-      <w:hyperlink w:history="1" r:id="rId6wwvjlgjwf_oneylncgj7">
+      <w:hyperlink w:history="1" r:id="rIdsg3rmojgqnqbu1tiojlbe">
         <w:r>
           <w:rPr>
             <w:color w:val="1D4ED8"/>
@@ -32239,7 +32239,7 @@
         </w:rPr>
         <w:t xml:space="preserve"> </w:t>
       </w:r>
-      <w:hyperlink w:history="1" r:id="rIdrngijjl7uclcjtdjxsxtu">
+      <w:hyperlink w:history="1" r:id="rIdembzllsdolgdypusvatg9">
         <w:r>
           <w:rPr>
             <w:color w:val="1D4ED8"/>
@@ -32300,7 +32300,7 @@
         </w:rPr>
         <w:t xml:space="preserve"> </w:t>
       </w:r>
-      <w:hyperlink w:history="1" r:id="rIdmrqb4im2vf57-wt9palff">
+      <w:hyperlink w:history="1" r:id="rIdy1437-uiqb_vlr5isz9px">
         <w:r>
           <w:rPr>
             <w:color w:val="1D4ED8"/>
@@ -32361,7 +32361,7 @@
         </w:rPr>
         <w:t xml:space="preserve"> </w:t>
       </w:r>
-      <w:hyperlink w:history="1" r:id="rId1ujhgeokpxltl9grd-opn">
+      <w:hyperlink w:history="1" r:id="rIdlyfxbmj16ytsl8buv3o6e">
         <w:r>
           <w:rPr>
             <w:color w:val="1D4ED8"/>
@@ -32422,7 +32422,7 @@
         </w:rPr>
         <w:t xml:space="preserve"> </w:t>
       </w:r>
-      <w:hyperlink w:history="1" r:id="rIda4bsv9o30jyvfygks4ndl">
+      <w:hyperlink w:history="1" r:id="rIddag6qpv5sdbhtnwbb_gzi">
         <w:r>
           <w:rPr>
             <w:color w:val="1D4ED8"/>
@@ -32483,7 +32483,7 @@
         </w:rPr>
         <w:t xml:space="preserve"> </w:t>
       </w:r>
-      <w:hyperlink w:history="1" r:id="rIduphtkc9dqmaidz0fl1ovj">
+      <w:hyperlink w:history="1" r:id="rIdbhrzhmo-pvdc4skhaxcwu">
         <w:r>
           <w:rPr>
             <w:color w:val="1D4ED8"/>
@@ -32544,7 +32544,7 @@
         </w:rPr>
         <w:t xml:space="preserve"> </w:t>
       </w:r>
-      <w:hyperlink w:history="1" r:id="rIdqc6cdw1wc-1fmqkjpotbr">
+      <w:hyperlink w:history="1" r:id="rId-1po8m0f7uky9jzmplmlr">
         <w:r>
           <w:rPr>
             <w:color w:val="1D4ED8"/>
@@ -32605,7 +32605,7 @@
         </w:rPr>
         <w:t xml:space="preserve"> </w:t>
       </w:r>
-      <w:hyperlink w:history="1" r:id="rIdyxisq9q-edble0so1fs8m">
+      <w:hyperlink w:history="1" r:id="rIdbe7s7vpgttoo7wwffgm7q">
         <w:r>
           <w:rPr>
             <w:color w:val="1D4ED8"/>
@@ -32666,7 +32666,7 @@
         </w:rPr>
         <w:t xml:space="preserve"> </w:t>
       </w:r>
-      <w:hyperlink w:history="1" r:id="rIdjnxbq3cmrv-fjut_kr5c9">
+      <w:hyperlink w:history="1" r:id="rIdxxeoz7tohcb7p1mh4l6va">
         <w:r>
           <w:rPr>
             <w:color w:val="1D4ED8"/>
@@ -32727,7 +32727,7 @@
         </w:rPr>
         <w:t xml:space="preserve"> </w:t>
       </w:r>
-      <w:hyperlink w:history="1" r:id="rIdmeq3jrugnzcfagqb-bor8">
+      <w:hyperlink w:history="1" r:id="rIdci2ube1d4grnczvdsqayg">
         <w:r>
           <w:rPr>
             <w:color w:val="1D4ED8"/>
@@ -32788,7 +32788,7 @@
         </w:rPr>
         <w:t xml:space="preserve"> </w:t>
       </w:r>
-      <w:hyperlink w:history="1" r:id="rIdku8a-mse-o9q1g0nbzgvl">
+      <w:hyperlink w:history="1" r:id="rIdvrxolq72-vmd8f7muwtyl">
         <w:r>
           <w:rPr>
             <w:color w:val="1D4ED8"/>
@@ -32849,7 +32849,7 @@
         </w:rPr>
         <w:t xml:space="preserve"> </w:t>
       </w:r>
-      <w:hyperlink w:history="1" r:id="rId9zjzkfcg6vgzahgcib-20">
+      <w:hyperlink w:history="1" r:id="rIdzxwqjb6av97iwyuzfstrp">
         <w:r>
           <w:rPr>
             <w:color w:val="1D4ED8"/>
@@ -32910,7 +32910,7 @@
         </w:rPr>
         <w:t xml:space="preserve"> </w:t>
       </w:r>
-      <w:hyperlink w:history="1" r:id="rId1vettxxn7pioei9gidmdb">
+      <w:hyperlink w:history="1" r:id="rIdrdmpkl7rcbqjz1hwifjlx">
         <w:r>
           <w:rPr>
             <w:color w:val="1D4ED8"/>
@@ -32971,7 +32971,7 @@
         </w:rPr>
         <w:t xml:space="preserve"> </w:t>
       </w:r>
-      <w:hyperlink w:history="1" r:id="rIdq-4783cbl6iyzp6htlk23">
+      <w:hyperlink w:history="1" r:id="rId4me8-dwzaherbuddvwtrt">
         <w:r>
           <w:rPr>
             <w:color w:val="1D4ED8"/>
@@ -33032,7 +33032,7 @@
         </w:rPr>
         <w:t xml:space="preserve"> </w:t>
       </w:r>
-      <w:hyperlink w:history="1" r:id="rId4frx2pe_nmhciqux5ajcr">
+      <w:hyperlink w:history="1" r:id="rIdardcq4s_kmdvj3-6tgxq9">
         <w:r>
           <w:rPr>
             <w:color w:val="1D4ED8"/>

</xml_diff>